<commit_message>
update with new figs
</commit_message>
<xml_diff>
--- a/Preliminary-Results.docx
+++ b/Preliminary-Results.docx
@@ -219,7 +219,7 @@
           <wp:inline>
             <wp:extent cx="5334000" cy="3556000"/>
             <wp:effectExtent b="0" l="0" r="0" t="0"/>
-            <wp:docPr descr="Growth rate (g/day) of first litter juveniles in response to litter size. Data includes all years and all treatment grids (n = 7392)." title="" id="20" name="Picture"/>
+            <wp:docPr descr="Growth rate (g/day) of first litter juveniles in response to categories of litter size. Data includes all years and all treatment grids (n = 7392)." title="" id="20" name="Picture"/>
             <a:graphic>
               <a:graphicData uri="http://schemas.openxmlformats.org/drawingml/2006/picture">
                 <pic:pic>
@@ -262,7 +262,7 @@
         <w:pStyle w:val="ImageCaption"/>
       </w:pPr>
       <w:r>
-        <w:t xml:space="preserve">Growth rate (g/day) of first litter juveniles in response to litter size. Data includes all years and all treatment grids (n = 7392).</w:t>
+        <w:t xml:space="preserve">Growth rate (g/day) of first litter juveniles in response to categories of litter size. Data includes all years and all treatment grids (n = 7392).</w:t>
       </w:r>
     </w:p>
     <w:p>
@@ -329,7 +329,7 @@
           <wp:inline>
             <wp:extent cx="5334000" cy="3556000"/>
             <wp:effectExtent b="0" l="0" r="0" t="0"/>
-            <wp:docPr descr="Growth rate (g/day) of first litter juveniles in response to one of four grid treatments, control (n = 4044), food add (n = 2628), rattle playback (n = 143), or chickadee playback (n = 30)." title="" id="26" name="Picture"/>
+            <wp:docPr descr="Growth rate (g/day) of first litter juveniles in response to one of four grid treatments, control (n = 0), food add (n = 2655), or rattle playback (n = 143)." title="" id="26" name="Picture"/>
             <a:graphic>
               <a:graphicData uri="http://schemas.openxmlformats.org/drawingml/2006/picture">
                 <pic:pic>
@@ -372,7 +372,7 @@
         <w:pStyle w:val="ImageCaption"/>
       </w:pPr>
       <w:r>
-        <w:t xml:space="preserve">Growth rate (g/day) of first litter juveniles in response to one of four grid treatments, control (n = 4044), food add (n = 2628), rattle playback (n = 143), or chickadee playback (n = 30).</w:t>
+        <w:t xml:space="preserve">Growth rate (g/day) of first litter juveniles in response to one of four grid treatments, control (n = 0), food add (n = 2655), or rattle playback (n = 143).</w:t>
       </w:r>
     </w:p>
     <w:p>
@@ -384,7 +384,7 @@
           <wp:inline>
             <wp:extent cx="5334000" cy="3556000"/>
             <wp:effectExtent b="0" l="0" r="0" t="0"/>
-            <wp:docPr descr="Average annual growth rates (g/day) of first litter juveniles, grouped by grid treatment which here included control (green; n = 4044), food add (blue; n = 2628), rattle playback (purple; n = 143), or chickadee playback (red; n = 30)." title="" id="29" name="Picture"/>
+            <wp:docPr descr="Average annual growth rates (g/day) of first litter juveniles, grouped by grid treatment which here included control (red; n = 0), food add (green; n = 2655), or rattle playback (blue; n = 143)." title="" id="29" name="Picture"/>
             <a:graphic>
               <a:graphicData uri="http://schemas.openxmlformats.org/drawingml/2006/picture">
                 <pic:pic>
@@ -427,7 +427,7 @@
         <w:pStyle w:val="ImageCaption"/>
       </w:pPr>
       <w:r>
-        <w:t xml:space="preserve">Average annual growth rates (g/day) of first litter juveniles, grouped by grid treatment which here included control (green; n = 4044), food add (blue; n = 2628), rattle playback (purple; n = 143), or chickadee playback (red; n = 30).</w:t>
+        <w:t xml:space="preserve">Average annual growth rates (g/day) of first litter juveniles, grouped by grid treatment which here included control (red; n = 0), food add (green; n = 2655), or rattle playback (blue; n = 143).</w:t>
       </w:r>
     </w:p>
     <w:bookmarkEnd w:id="31"/>

</xml_diff>